<commit_message>
comp-175: fix Midterm 3 commands not actually covered in class
Audited all 18 commands against real taught content (not just the
allCommands summary table, which only shows one example per command
and missed genuinely-taught flags like nmap -O and kill -9). Four
were wrong: dig +short (never taught, class only used bare dig),
find -type f (class used -name instead), and systemctl enable /
journalctl -u targeting nginx/sshd (neither service was ever used in
class examples -- cron was the one actually demonstrated for both).
Fixed all four to match real class content; answer letters unchanged
since each question kept its assigned position. Still verified at
exactly 2 pages.

Co-Authored-By: Claude Sonnet 5 <noreply@anthropic.com>
</commit_message>
<xml_diff>
--- a/comp-175/Midterm3-Modules1-6.docx
+++ b/comp-175/Midterm3-Modules1-6.docx
@@ -298,79 +298,79 @@
           <w:sz w:val="16"/>
           <w:szCs w:val="16"/>
         </w:rPr>
-        <w:t xml:space="preserve">3. What does dig +short example.com do?</w:t>
-      </w:r>
-    </w:p>
-    <w:p>
-      <w:pPr>
-        <w:spacing w:before="0" w:after="0" w:line="216" w:lineRule="auto"/>
-        <w:rPr>
-          <w:rFonts w:cstheme="minorHAnsi"/>
-          <w:sz w:val="16"/>
-          <w:szCs w:val="16"/>
-        </w:rPr>
-      </w:pPr>
-      <w:r>
-        <w:rPr>
-          <w:rFonts w:cstheme="minorHAnsi"/>
-          <w:sz w:val="16"/>
-          <w:szCs w:val="16"/>
-        </w:rPr>
-        <w:t xml:space="preserve">A. Shows the full DNS response with every section</w:t>
-      </w:r>
-    </w:p>
-    <w:p>
-      <w:pPr>
-        <w:spacing w:before="0" w:after="0" w:line="216" w:lineRule="auto"/>
-        <w:rPr>
-          <w:rFonts w:cstheme="minorHAnsi"/>
-          <w:sz w:val="16"/>
-          <w:szCs w:val="16"/>
-        </w:rPr>
-      </w:pPr>
-      <w:r>
-        <w:rPr>
-          <w:rFonts w:cstheme="minorHAnsi"/>
-          <w:sz w:val="16"/>
-          <w:szCs w:val="16"/>
-        </w:rPr>
-        <w:t xml:space="preserve">B. Registers a new domain name</w:t>
-      </w:r>
-    </w:p>
-    <w:p>
-      <w:pPr>
-        <w:spacing w:before="0" w:after="0" w:line="216" w:lineRule="auto"/>
-        <w:rPr>
-          <w:rFonts w:cstheme="minorHAnsi"/>
-          <w:sz w:val="16"/>
-          <w:szCs w:val="16"/>
-        </w:rPr>
-      </w:pPr>
-      <w:r>
-        <w:rPr>
-          <w:rFonts w:cstheme="minorHAnsi"/>
-          <w:sz w:val="16"/>
-          <w:szCs w:val="16"/>
-        </w:rPr>
-        <w:t xml:space="preserve">C. Shows just the resolved IP address, no extra detail</w:t>
-      </w:r>
-    </w:p>
-    <w:p>
-      <w:pPr>
-        <w:spacing w:before="0" w:after="0" w:line="216" w:lineRule="auto"/>
-        <w:rPr>
-          <w:rFonts w:cstheme="minorHAnsi"/>
-          <w:sz w:val="16"/>
-          <w:szCs w:val="16"/>
-        </w:rPr>
-      </w:pPr>
-      <w:r>
-        <w:rPr>
-          <w:rFonts w:cstheme="minorHAnsi"/>
-          <w:sz w:val="16"/>
-          <w:szCs w:val="16"/>
-        </w:rPr>
-        <w:t xml:space="preserve">D. Only works for .com domains</w:t>
+        <w:t xml:space="preserve">3. What does dig example.com do?</w:t>
+      </w:r>
+    </w:p>
+    <w:p>
+      <w:pPr>
+        <w:spacing w:before="0" w:after="0" w:line="216" w:lineRule="auto"/>
+        <w:rPr>
+          <w:rFonts w:cstheme="minorHAnsi"/>
+          <w:sz w:val="16"/>
+          <w:szCs w:val="16"/>
+        </w:rPr>
+      </w:pPr>
+      <w:r>
+        <w:rPr>
+          <w:rFonts w:cstheme="minorHAnsi"/>
+          <w:sz w:val="16"/>
+          <w:szCs w:val="16"/>
+        </w:rPr>
+        <w:t xml:space="preserve">A. Registers a new domain name</w:t>
+      </w:r>
+    </w:p>
+    <w:p>
+      <w:pPr>
+        <w:spacing w:before="0" w:after="0" w:line="216" w:lineRule="auto"/>
+        <w:rPr>
+          <w:rFonts w:cstheme="minorHAnsi"/>
+          <w:sz w:val="16"/>
+          <w:szCs w:val="16"/>
+        </w:rPr>
+      </w:pPr>
+      <w:r>
+        <w:rPr>
+          <w:rFonts w:cstheme="minorHAnsi"/>
+          <w:sz w:val="16"/>
+          <w:szCs w:val="16"/>
+        </w:rPr>
+        <w:t xml:space="preserve">B. Only works for .com domains</w:t>
+      </w:r>
+    </w:p>
+    <w:p>
+      <w:pPr>
+        <w:spacing w:before="0" w:after="0" w:line="216" w:lineRule="auto"/>
+        <w:rPr>
+          <w:rFonts w:cstheme="minorHAnsi"/>
+          <w:sz w:val="16"/>
+          <w:szCs w:val="16"/>
+        </w:rPr>
+      </w:pPr>
+      <w:r>
+        <w:rPr>
+          <w:rFonts w:cstheme="minorHAnsi"/>
+          <w:sz w:val="16"/>
+          <w:szCs w:val="16"/>
+        </w:rPr>
+        <w:t xml:space="preserve">C. Looks up DNS records for the domain</w:t>
+      </w:r>
+    </w:p>
+    <w:p>
+      <w:pPr>
+        <w:spacing w:before="0" w:after="0" w:line="216" w:lineRule="auto"/>
+        <w:rPr>
+          <w:rFonts w:cstheme="minorHAnsi"/>
+          <w:sz w:val="16"/>
+          <w:szCs w:val="16"/>
+        </w:rPr>
+      </w:pPr>
+      <w:r>
+        <w:rPr>
+          <w:rFonts w:cstheme="minorHAnsi"/>
+          <w:sz w:val="16"/>
+          <w:szCs w:val="16"/>
+        </w:rPr>
+        <w:t xml:space="preserve">D. Deletes the domain's DNS cache</w:t>
       </w:r>
     </w:p>
     <w:p>
@@ -724,61 +724,61 @@
           <w:sz w:val="16"/>
           <w:szCs w:val="16"/>
         </w:rPr>
-        <w:t xml:space="preserve">7. What does find /srv/library -type f do?</w:t>
-      </w:r>
-    </w:p>
-    <w:p>
-      <w:pPr>
-        <w:spacing w:before="0" w:after="0" w:line="216" w:lineRule="auto"/>
-        <w:rPr>
-          <w:rFonts w:cstheme="minorHAnsi"/>
-          <w:sz w:val="16"/>
-          <w:szCs w:val="16"/>
-        </w:rPr>
-      </w:pPr>
-      <w:r>
-        <w:rPr>
-          <w:rFonts w:cstheme="minorHAnsi"/>
-          <w:sz w:val="16"/>
-          <w:szCs w:val="16"/>
-        </w:rPr>
-        <w:t xml:space="preserve">A. Lists only directories, not files</w:t>
-      </w:r>
-    </w:p>
-    <w:p>
-      <w:pPr>
-        <w:spacing w:before="0" w:after="0" w:line="216" w:lineRule="auto"/>
-        <w:rPr>
-          <w:rFonts w:cstheme="minorHAnsi"/>
-          <w:sz w:val="16"/>
-          <w:szCs w:val="16"/>
-        </w:rPr>
-      </w:pPr>
-      <w:r>
-        <w:rPr>
-          <w:rFonts w:cstheme="minorHAnsi"/>
-          <w:sz w:val="16"/>
-          <w:szCs w:val="16"/>
-        </w:rPr>
-        <w:t xml:space="preserve">B. Deletes every file found</w:t>
-      </w:r>
-    </w:p>
-    <w:p>
-      <w:pPr>
-        <w:spacing w:before="0" w:after="0" w:line="216" w:lineRule="auto"/>
-        <w:rPr>
-          <w:rFonts w:cstheme="minorHAnsi"/>
-          <w:sz w:val="16"/>
-          <w:szCs w:val="16"/>
-        </w:rPr>
-      </w:pPr>
-      <w:r>
-        <w:rPr>
-          <w:rFonts w:cstheme="minorHAnsi"/>
-          <w:sz w:val="16"/>
-          <w:szCs w:val="16"/>
-        </w:rPr>
-        <w:t xml:space="preserve">C. Lists only regular files, not directories</w:t>
+        <w:t xml:space="preserve">7. What does find /home -name notes.txt do?</w:t>
+      </w:r>
+    </w:p>
+    <w:p>
+      <w:pPr>
+        <w:spacing w:before="0" w:after="0" w:line="216" w:lineRule="auto"/>
+        <w:rPr>
+          <w:rFonts w:cstheme="minorHAnsi"/>
+          <w:sz w:val="16"/>
+          <w:szCs w:val="16"/>
+        </w:rPr>
+      </w:pPr>
+      <w:r>
+        <w:rPr>
+          <w:rFonts w:cstheme="minorHAnsi"/>
+          <w:sz w:val="16"/>
+          <w:szCs w:val="16"/>
+        </w:rPr>
+        <w:t xml:space="preserve">A. Lists every directory under /home</w:t>
+      </w:r>
+    </w:p>
+    <w:p>
+      <w:pPr>
+        <w:spacing w:before="0" w:after="0" w:line="216" w:lineRule="auto"/>
+        <w:rPr>
+          <w:rFonts w:cstheme="minorHAnsi"/>
+          <w:sz w:val="16"/>
+          <w:szCs w:val="16"/>
+        </w:rPr>
+      </w:pPr>
+      <w:r>
+        <w:rPr>
+          <w:rFonts w:cstheme="minorHAnsi"/>
+          <w:sz w:val="16"/>
+          <w:szCs w:val="16"/>
+        </w:rPr>
+        <w:t xml:space="preserve">B. Deletes any file named notes.txt</w:t>
+      </w:r>
+    </w:p>
+    <w:p>
+      <w:pPr>
+        <w:spacing w:before="0" w:after="0" w:line="216" w:lineRule="auto"/>
+        <w:rPr>
+          <w:rFonts w:cstheme="minorHAnsi"/>
+          <w:sz w:val="16"/>
+          <w:szCs w:val="16"/>
+        </w:rPr>
+      </w:pPr>
+      <w:r>
+        <w:rPr>
+          <w:rFonts w:cstheme="minorHAnsi"/>
+          <w:sz w:val="16"/>
+          <w:szCs w:val="16"/>
+        </w:rPr>
+        <w:t xml:space="preserve">C. Searches for a file named notes.txt</w:t>
       </w:r>
     </w:p>
     <w:p>
@@ -1648,120 +1648,120 @@
           <w:sz w:val="16"/>
           <w:szCs w:val="16"/>
         </w:rPr>
-        <w:t xml:space="preserve">16. What does systemctl enable nginx do?</w:t>
-      </w:r>
-    </w:p>
-    <w:p>
-      <w:pPr>
-        <w:spacing w:before="0" w:after="0" w:line="216" w:lineRule="auto"/>
-        <w:rPr>
-          <w:rFonts w:cstheme="minorHAnsi"/>
-          <w:sz w:val="16"/>
-          <w:szCs w:val="16"/>
-        </w:rPr>
-      </w:pPr>
-      <w:r>
-        <w:rPr>
-          <w:rFonts w:cstheme="minorHAnsi"/>
-          <w:sz w:val="16"/>
-          <w:szCs w:val="16"/>
-        </w:rPr>
-        <w:t xml:space="preserve">A. Starts nginx running right now</w:t>
-      </w:r>
-    </w:p>
-    <w:p>
-      <w:pPr>
-        <w:spacing w:before="0" w:after="0" w:line="216" w:lineRule="auto"/>
-        <w:rPr>
-          <w:rFonts w:cstheme="minorHAnsi"/>
-          <w:sz w:val="16"/>
-          <w:szCs w:val="16"/>
-        </w:rPr>
-      </w:pPr>
-      <w:r>
-        <w:rPr>
-          <w:rFonts w:cstheme="minorHAnsi"/>
-          <w:sz w:val="16"/>
-          <w:szCs w:val="16"/>
-        </w:rPr>
-        <w:t xml:space="preserve">B. Permanently removes nginx</w:t>
-      </w:r>
-    </w:p>
-    <w:p>
-      <w:pPr>
-        <w:spacing w:before="0" w:after="0" w:line="216" w:lineRule="auto"/>
-        <w:rPr>
-          <w:rFonts w:cstheme="minorHAnsi"/>
-          <w:sz w:val="16"/>
-          <w:szCs w:val="16"/>
-        </w:rPr>
-      </w:pPr>
-      <w:r>
-        <w:rPr>
-          <w:rFonts w:cstheme="minorHAnsi"/>
-          <w:sz w:val="16"/>
-          <w:szCs w:val="16"/>
-        </w:rPr>
-        <w:t xml:space="preserve">C. Restarts nginx if it's already running</w:t>
-      </w:r>
-    </w:p>
-    <w:p>
-      <w:pPr>
-        <w:spacing w:before="0" w:after="0" w:line="216" w:lineRule="auto"/>
-        <w:rPr>
-          <w:rFonts w:cstheme="minorHAnsi"/>
-          <w:sz w:val="16"/>
-          <w:szCs w:val="16"/>
-        </w:rPr>
-      </w:pPr>
-      <w:r>
-        <w:rPr>
-          <w:rFonts w:cstheme="minorHAnsi"/>
-          <w:sz w:val="16"/>
-          <w:szCs w:val="16"/>
-        </w:rPr>
-        <w:t xml:space="preserve">D. Makes nginx start automatically at boot</w:t>
-      </w:r>
-    </w:p>
-    <w:p>
-      <w:pPr>
-        <w:spacing w:before="0" w:after="0" w:line="216" w:lineRule="auto"/>
-        <w:keepNext/>
-        <w:rPr>
-          <w:rFonts w:cstheme="minorHAnsi"/>
-          <w:b/>
-          <w:bCs/>
-          <w:sz w:val="16"/>
-          <w:szCs w:val="16"/>
-        </w:rPr>
-      </w:pPr>
-      <w:r>
-        <w:rPr>
-          <w:rFonts w:cstheme="minorHAnsi"/>
-          <w:b/>
-          <w:bCs/>
-          <w:sz w:val="16"/>
-          <w:szCs w:val="16"/>
-        </w:rPr>
-        <w:t xml:space="preserve">17. What does journalctl -u sshd do?</w:t>
-      </w:r>
-    </w:p>
-    <w:p>
-      <w:pPr>
-        <w:spacing w:before="0" w:after="0" w:line="216" w:lineRule="auto"/>
-        <w:rPr>
-          <w:rFonts w:cstheme="minorHAnsi"/>
-          <w:sz w:val="16"/>
-          <w:szCs w:val="16"/>
-        </w:rPr>
-      </w:pPr>
-      <w:r>
-        <w:rPr>
-          <w:rFonts w:cstheme="minorHAnsi"/>
-          <w:sz w:val="16"/>
-          <w:szCs w:val="16"/>
-        </w:rPr>
-        <w:t xml:space="preserve">A. Shows log entries for just the sshd service</w:t>
+        <w:t xml:space="preserve">16. What does sudo systemctl enable cron do?</w:t>
+      </w:r>
+    </w:p>
+    <w:p>
+      <w:pPr>
+        <w:spacing w:before="0" w:after="0" w:line="216" w:lineRule="auto"/>
+        <w:rPr>
+          <w:rFonts w:cstheme="minorHAnsi"/>
+          <w:sz w:val="16"/>
+          <w:szCs w:val="16"/>
+        </w:rPr>
+      </w:pPr>
+      <w:r>
+        <w:rPr>
+          <w:rFonts w:cstheme="minorHAnsi"/>
+          <w:sz w:val="16"/>
+          <w:szCs w:val="16"/>
+        </w:rPr>
+        <w:t xml:space="preserve">A. Starts cron running right now</w:t>
+      </w:r>
+    </w:p>
+    <w:p>
+      <w:pPr>
+        <w:spacing w:before="0" w:after="0" w:line="216" w:lineRule="auto"/>
+        <w:rPr>
+          <w:rFonts w:cstheme="minorHAnsi"/>
+          <w:sz w:val="16"/>
+          <w:szCs w:val="16"/>
+        </w:rPr>
+      </w:pPr>
+      <w:r>
+        <w:rPr>
+          <w:rFonts w:cstheme="minorHAnsi"/>
+          <w:sz w:val="16"/>
+          <w:szCs w:val="16"/>
+        </w:rPr>
+        <w:t xml:space="preserve">B. Permanently removes cron</w:t>
+      </w:r>
+    </w:p>
+    <w:p>
+      <w:pPr>
+        <w:spacing w:before="0" w:after="0" w:line="216" w:lineRule="auto"/>
+        <w:rPr>
+          <w:rFonts w:cstheme="minorHAnsi"/>
+          <w:sz w:val="16"/>
+          <w:szCs w:val="16"/>
+        </w:rPr>
+      </w:pPr>
+      <w:r>
+        <w:rPr>
+          <w:rFonts w:cstheme="minorHAnsi"/>
+          <w:sz w:val="16"/>
+          <w:szCs w:val="16"/>
+        </w:rPr>
+        <w:t xml:space="preserve">C. Restarts cron if it's already running</w:t>
+      </w:r>
+    </w:p>
+    <w:p>
+      <w:pPr>
+        <w:spacing w:before="0" w:after="0" w:line="216" w:lineRule="auto"/>
+        <w:rPr>
+          <w:rFonts w:cstheme="minorHAnsi"/>
+          <w:sz w:val="16"/>
+          <w:szCs w:val="16"/>
+        </w:rPr>
+      </w:pPr>
+      <w:r>
+        <w:rPr>
+          <w:rFonts w:cstheme="minorHAnsi"/>
+          <w:sz w:val="16"/>
+          <w:szCs w:val="16"/>
+        </w:rPr>
+        <w:t xml:space="preserve">D. Makes cron start automatically at boot</w:t>
+      </w:r>
+    </w:p>
+    <w:p>
+      <w:pPr>
+        <w:spacing w:before="0" w:after="0" w:line="216" w:lineRule="auto"/>
+        <w:keepNext/>
+        <w:rPr>
+          <w:rFonts w:cstheme="minorHAnsi"/>
+          <w:b/>
+          <w:bCs/>
+          <w:sz w:val="16"/>
+          <w:szCs w:val="16"/>
+        </w:rPr>
+      </w:pPr>
+      <w:r>
+        <w:rPr>
+          <w:rFonts w:cstheme="minorHAnsi"/>
+          <w:b/>
+          <w:bCs/>
+          <w:sz w:val="16"/>
+          <w:szCs w:val="16"/>
+        </w:rPr>
+        <w:t xml:space="preserve">17. What does journalctl -u cron do?</w:t>
+      </w:r>
+    </w:p>
+    <w:p>
+      <w:pPr>
+        <w:spacing w:before="0" w:after="0" w:line="216" w:lineRule="auto"/>
+        <w:rPr>
+          <w:rFonts w:cstheme="minorHAnsi"/>
+          <w:sz w:val="16"/>
+          <w:szCs w:val="16"/>
+        </w:rPr>
+      </w:pPr>
+      <w:r>
+        <w:rPr>
+          <w:rFonts w:cstheme="minorHAnsi"/>
+          <w:sz w:val="16"/>
+          <w:szCs w:val="16"/>
+        </w:rPr>
+        <w:t xml:space="preserve">A. Shows log entries for just the cron service</w:t>
       </w:r>
     </w:p>
     <w:p>
@@ -1797,25 +1797,25 @@
           <w:sz w:val="16"/>
           <w:szCs w:val="16"/>
         </w:rPr>
-        <w:t xml:space="preserve">C. Deletes old sshd log entries</w:t>
-      </w:r>
-    </w:p>
-    <w:p>
-      <w:pPr>
-        <w:spacing w:before="0" w:after="0" w:line="216" w:lineRule="auto"/>
-        <w:rPr>
-          <w:rFonts w:cstheme="minorHAnsi"/>
-          <w:sz w:val="16"/>
-          <w:szCs w:val="16"/>
-        </w:rPr>
-      </w:pPr>
-      <w:r>
-        <w:rPr>
-          <w:rFonts w:cstheme="minorHAnsi"/>
-          <w:sz w:val="16"/>
-          <w:szCs w:val="16"/>
-        </w:rPr>
-        <w:t xml:space="preserve">D. Restarts the sshd service</w:t>
+        <w:t xml:space="preserve">C. Deletes old cron log entries</w:t>
+      </w:r>
+    </w:p>
+    <w:p>
+      <w:pPr>
+        <w:spacing w:before="0" w:after="0" w:line="216" w:lineRule="auto"/>
+        <w:rPr>
+          <w:rFonts w:cstheme="minorHAnsi"/>
+          <w:sz w:val="16"/>
+          <w:szCs w:val="16"/>
+        </w:rPr>
+      </w:pPr>
+      <w:r>
+        <w:rPr>
+          <w:rFonts w:cstheme="minorHAnsi"/>
+          <w:sz w:val="16"/>
+          <w:szCs w:val="16"/>
+        </w:rPr>
+        <w:t xml:space="preserve">D. Restarts the cron service</w:t>
       </w:r>
     </w:p>
     <w:p>

</xml_diff>